<commit_message>
Fixing meeting report 6
</commit_message>
<xml_diff>
--- a/Meeting Reports/Meeting Report- Week 6.docx
+++ b/Meeting Reports/Meeting Report- Week 6.docx
@@ -1041,89 +1041,811 @@
           <w:sz w:val="22"/>
           <w:lang w:val="en-DE"/>
         </w:rPr>
-        <w:t xml:space="preserve"> Making the small improvements on ERD.</w:t>
-      </w:r>
-    </w:p>
-    <w:p>
-      <w:pPr>
-        <w:rPr>
-          <w:rFonts w:ascii="Arial" w:hAnsi="Arial"/>
-          <w:b/>
-          <w:sz w:val="22"/>
-          <w:lang w:val="en-DE"/>
-        </w:rPr>
-      </w:pPr>
-    </w:p>
-    <w:p>
-      <w:pPr>
-        <w:rPr>
-          <w:rFonts w:ascii="Arial" w:hAnsi="Arial"/>
-          <w:b/>
-          <w:sz w:val="22"/>
-          <w:lang w:val="en-DE"/>
-        </w:rPr>
-      </w:pPr>
-      <w:r>
-        <w:rPr>
-          <w:rFonts w:ascii="Arial" w:hAnsi="Arial"/>
-          <w:b/>
-          <w:sz w:val="22"/>
-          <w:lang w:val="en-DE"/>
-        </w:rPr>
-        <w:t xml:space="preserve">All members- </w:t>
-      </w:r>
-    </w:p>
-    <w:p>
-      <w:pPr>
-        <w:rPr>
-          <w:rFonts w:ascii="Arial" w:hAnsi="Arial"/>
-          <w:sz w:val="22"/>
-          <w:lang w:val="en-DE"/>
-        </w:rPr>
-      </w:pPr>
-      <w:r>
-        <w:rPr>
-          <w:rFonts w:ascii="Arial" w:hAnsi="Arial"/>
-          <w:b/>
-          <w:sz w:val="22"/>
-          <w:lang w:val="en-DE"/>
-        </w:rPr>
-        <w:t xml:space="preserve">1. </w:t>
-      </w:r>
-      <w:r>
-        <w:rPr>
-          <w:rFonts w:ascii="Arial" w:hAnsi="Arial"/>
-          <w:sz w:val="22"/>
-          <w:lang w:val="en-DE"/>
-        </w:rPr>
-        <w:t>Designing the class diagram for the system.</w:t>
-      </w:r>
-    </w:p>
-    <w:p>
-      <w:pPr>
-        <w:rPr>
-          <w:rFonts w:ascii="Arial" w:hAnsi="Arial"/>
-          <w:sz w:val="22"/>
-          <w:lang w:val="en-DE"/>
-        </w:rPr>
-      </w:pPr>
-      <w:r>
-        <w:rPr>
-          <w:rFonts w:ascii="Arial" w:hAnsi="Arial"/>
-          <w:b/>
-          <w:sz w:val="22"/>
-          <w:lang w:val="en-DE"/>
-        </w:rPr>
-        <w:t>2.</w:t>
-      </w:r>
-      <w:r>
-        <w:rPr>
-          <w:rFonts w:ascii="Arial" w:hAnsi="Arial"/>
-          <w:sz w:val="22"/>
-          <w:lang w:val="en-DE"/>
-        </w:rPr>
-        <w:t>Creating sequence diagram for each activity diagram (for the functional requirements they had) using the classes designed in class diagram.</w:t>
-      </w:r>
+        <w:t xml:space="preserve"> Making the small improvements on ERD</w:t>
+      </w:r>
+      <w:r>
+        <w:rPr>
+          <w:rFonts w:ascii="Arial" w:hAnsi="Arial"/>
+          <w:sz w:val="22"/>
+          <w:lang w:val="en-DE"/>
+        </w:rPr>
+        <w:t xml:space="preserve"> suggested during last week’s presentation.</w:t>
+      </w:r>
+      <w:bookmarkStart w:id="0" w:name="_GoBack"/>
+      <w:bookmarkEnd w:id="0"/>
+      <w:r>
+        <w:rPr>
+          <w:rFonts w:ascii="Arial" w:hAnsi="Arial"/>
+          <w:sz w:val="22"/>
+          <w:lang w:val="en-DE"/>
+        </w:rPr>
+        <w:t>.</w:t>
+      </w:r>
+    </w:p>
+    <w:p>
+      <w:pPr>
+        <w:rPr>
+          <w:rFonts w:ascii="Arial" w:hAnsi="Arial"/>
+          <w:sz w:val="22"/>
+          <w:lang w:val="en-DE"/>
+        </w:rPr>
+      </w:pPr>
+      <w:r>
+        <w:rPr>
+          <w:rFonts w:ascii="Arial" w:hAnsi="Arial"/>
+          <w:sz w:val="22"/>
+          <w:lang w:val="en-DE"/>
+        </w:rPr>
+        <w:t xml:space="preserve">                      Creating the tables for User, Tenant, </w:t>
+      </w:r>
+      <w:proofErr w:type="spellStart"/>
+      <w:r>
+        <w:rPr>
+          <w:rFonts w:ascii="Arial" w:hAnsi="Arial"/>
+          <w:sz w:val="22"/>
+          <w:lang w:val="en-DE"/>
+        </w:rPr>
+        <w:t>PropertyOwner</w:t>
+      </w:r>
+      <w:proofErr w:type="spellEnd"/>
+      <w:r>
+        <w:rPr>
+          <w:rFonts w:ascii="Arial" w:hAnsi="Arial"/>
+          <w:sz w:val="22"/>
+          <w:lang w:val="en-DE"/>
+        </w:rPr>
+        <w:t xml:space="preserve"> and Administrator for class diagram.</w:t>
+      </w:r>
+    </w:p>
+    <w:p>
+      <w:pPr>
+        <w:rPr>
+          <w:rFonts w:ascii="Arial" w:hAnsi="Arial"/>
+          <w:sz w:val="22"/>
+          <w:lang w:val="en-DE"/>
+        </w:rPr>
+      </w:pPr>
+      <w:r>
+        <w:rPr>
+          <w:rFonts w:ascii="Arial" w:hAnsi="Arial"/>
+          <w:sz w:val="22"/>
+          <w:lang w:val="en-DE"/>
+        </w:rPr>
+        <w:t xml:space="preserve">                      Creating the sequence diagrams for FR37-FR43</w:t>
+      </w:r>
+    </w:p>
+    <w:p>
+      <w:pPr>
+        <w:rPr>
+          <w:rFonts w:ascii="Arial" w:hAnsi="Arial"/>
+          <w:sz w:val="22"/>
+          <w:lang w:val="en-DE"/>
+        </w:rPr>
+      </w:pPr>
+    </w:p>
+    <w:p>
+      <w:pPr>
+        <w:rPr>
+          <w:rFonts w:ascii="Arial" w:hAnsi="Arial"/>
+          <w:sz w:val="22"/>
+          <w:lang w:val="en-DE"/>
+        </w:rPr>
+      </w:pPr>
+      <w:r>
+        <w:rPr>
+          <w:rFonts w:ascii="Arial" w:hAnsi="Arial"/>
+          <w:b/>
+          <w:sz w:val="22"/>
+          <w:lang w:val="en-DE"/>
+        </w:rPr>
+        <w:t xml:space="preserve">Anisa </w:t>
+      </w:r>
+      <w:proofErr w:type="spellStart"/>
+      <w:r>
+        <w:rPr>
+          <w:rFonts w:ascii="Arial" w:hAnsi="Arial"/>
+          <w:b/>
+          <w:sz w:val="22"/>
+          <w:lang w:val="en-DE"/>
+        </w:rPr>
+        <w:t>Domi</w:t>
+      </w:r>
+      <w:proofErr w:type="spellEnd"/>
+      <w:r>
+        <w:rPr>
+          <w:rFonts w:ascii="Arial" w:hAnsi="Arial"/>
+          <w:b/>
+          <w:sz w:val="22"/>
+          <w:lang w:val="en-DE"/>
+        </w:rPr>
+        <w:t>-</w:t>
+      </w:r>
+      <w:r>
+        <w:rPr>
+          <w:rFonts w:ascii="Arial" w:hAnsi="Arial"/>
+          <w:sz w:val="22"/>
+          <w:lang w:val="en-DE"/>
+        </w:rPr>
+        <w:t xml:space="preserve"> </w:t>
+      </w:r>
+      <w:r>
+        <w:rPr>
+          <w:rFonts w:ascii="Arial" w:hAnsi="Arial"/>
+          <w:sz w:val="22"/>
+          <w:lang w:val="en-DE"/>
+        </w:rPr>
+        <w:t xml:space="preserve">Creating the tables for </w:t>
+      </w:r>
+      <w:r>
+        <w:rPr>
+          <w:rFonts w:ascii="Arial" w:hAnsi="Arial"/>
+          <w:sz w:val="22"/>
+          <w:lang w:val="en-DE"/>
+        </w:rPr>
+        <w:t>Manager, Financier, HR</w:t>
+      </w:r>
+      <w:r>
+        <w:rPr>
+          <w:rFonts w:ascii="Arial" w:hAnsi="Arial"/>
+          <w:sz w:val="22"/>
+          <w:lang w:val="en-DE"/>
+        </w:rPr>
+        <w:t xml:space="preserve"> for class diagram.</w:t>
+      </w:r>
+    </w:p>
+    <w:p>
+      <w:pPr>
+        <w:rPr>
+          <w:rFonts w:ascii="Arial" w:hAnsi="Arial"/>
+          <w:sz w:val="22"/>
+          <w:lang w:val="en-DE"/>
+        </w:rPr>
+      </w:pPr>
+      <w:r>
+        <w:rPr>
+          <w:rFonts w:ascii="Arial" w:hAnsi="Arial"/>
+          <w:sz w:val="22"/>
+          <w:lang w:val="en-DE"/>
+        </w:rPr>
+        <w:t xml:space="preserve">                      Creating the sequence diagrams for FR</w:t>
+      </w:r>
+      <w:r>
+        <w:rPr>
+          <w:rFonts w:ascii="Arial" w:hAnsi="Arial"/>
+          <w:sz w:val="22"/>
+          <w:lang w:val="en-DE"/>
+        </w:rPr>
+        <w:t>1</w:t>
+      </w:r>
+      <w:r>
+        <w:rPr>
+          <w:rFonts w:ascii="Arial" w:hAnsi="Arial"/>
+          <w:sz w:val="22"/>
+          <w:lang w:val="en-DE"/>
+        </w:rPr>
+        <w:t>-FR</w:t>
+      </w:r>
+      <w:r>
+        <w:rPr>
+          <w:rFonts w:ascii="Arial" w:hAnsi="Arial"/>
+          <w:sz w:val="22"/>
+          <w:lang w:val="en-DE"/>
+        </w:rPr>
+        <w:t>6.</w:t>
+      </w:r>
+    </w:p>
+    <w:p>
+      <w:pPr>
+        <w:rPr>
+          <w:rFonts w:ascii="Arial" w:hAnsi="Arial"/>
+          <w:sz w:val="22"/>
+          <w:lang w:val="en-DE"/>
+        </w:rPr>
+      </w:pPr>
+    </w:p>
+    <w:p>
+      <w:pPr>
+        <w:rPr>
+          <w:rFonts w:ascii="Arial" w:hAnsi="Arial"/>
+          <w:sz w:val="22"/>
+          <w:lang w:val="en-DE"/>
+        </w:rPr>
+      </w:pPr>
+      <w:proofErr w:type="spellStart"/>
+      <w:r>
+        <w:rPr>
+          <w:rFonts w:ascii="Arial" w:hAnsi="Arial"/>
+          <w:b/>
+          <w:sz w:val="22"/>
+          <w:lang w:val="en-DE"/>
+        </w:rPr>
+        <w:t>Desard</w:t>
+      </w:r>
+      <w:proofErr w:type="spellEnd"/>
+      <w:r>
+        <w:rPr>
+          <w:rFonts w:ascii="Arial" w:hAnsi="Arial"/>
+          <w:b/>
+          <w:sz w:val="22"/>
+          <w:lang w:val="en-DE"/>
+        </w:rPr>
+        <w:t xml:space="preserve"> </w:t>
+      </w:r>
+      <w:proofErr w:type="spellStart"/>
+      <w:r>
+        <w:rPr>
+          <w:rFonts w:ascii="Arial" w:hAnsi="Arial"/>
+          <w:b/>
+          <w:sz w:val="22"/>
+          <w:lang w:val="en-DE"/>
+        </w:rPr>
+        <w:t>Lybeshari</w:t>
+      </w:r>
+      <w:proofErr w:type="spellEnd"/>
+      <w:r>
+        <w:rPr>
+          <w:rFonts w:ascii="Arial" w:hAnsi="Arial"/>
+          <w:b/>
+          <w:sz w:val="22"/>
+          <w:lang w:val="en-DE"/>
+        </w:rPr>
+        <w:t xml:space="preserve">- </w:t>
+      </w:r>
+      <w:r>
+        <w:rPr>
+          <w:rFonts w:ascii="Arial" w:hAnsi="Arial"/>
+          <w:sz w:val="22"/>
+          <w:lang w:val="en-DE"/>
+        </w:rPr>
+        <w:t xml:space="preserve">Creating the tables for </w:t>
+      </w:r>
+      <w:r>
+        <w:rPr>
+          <w:rFonts w:ascii="Arial" w:hAnsi="Arial"/>
+          <w:sz w:val="22"/>
+          <w:lang w:val="en-DE"/>
+        </w:rPr>
+        <w:t>Refund, Transaction, Conversation</w:t>
+      </w:r>
+      <w:r>
+        <w:rPr>
+          <w:rFonts w:ascii="Arial" w:hAnsi="Arial"/>
+          <w:sz w:val="22"/>
+          <w:lang w:val="en-DE"/>
+        </w:rPr>
+        <w:t xml:space="preserve"> for class diagram.</w:t>
+      </w:r>
+    </w:p>
+    <w:p>
+      <w:pPr>
+        <w:rPr>
+          <w:rFonts w:ascii="Arial" w:hAnsi="Arial"/>
+          <w:sz w:val="22"/>
+          <w:lang w:val="en-DE"/>
+        </w:rPr>
+      </w:pPr>
+      <w:r>
+        <w:rPr>
+          <w:rFonts w:ascii="Arial" w:hAnsi="Arial"/>
+          <w:sz w:val="22"/>
+          <w:lang w:val="en-DE"/>
+        </w:rPr>
+        <w:t xml:space="preserve">                      Creating the sequence diagrams for FR</w:t>
+      </w:r>
+      <w:r>
+        <w:rPr>
+          <w:rFonts w:ascii="Arial" w:hAnsi="Arial"/>
+          <w:sz w:val="22"/>
+          <w:lang w:val="en-DE"/>
+        </w:rPr>
+        <w:t>19</w:t>
+      </w:r>
+      <w:r>
+        <w:rPr>
+          <w:rFonts w:ascii="Arial" w:hAnsi="Arial"/>
+          <w:sz w:val="22"/>
+          <w:lang w:val="en-DE"/>
+        </w:rPr>
+        <w:t>-FR</w:t>
+      </w:r>
+      <w:r>
+        <w:rPr>
+          <w:rFonts w:ascii="Arial" w:hAnsi="Arial"/>
+          <w:sz w:val="22"/>
+          <w:lang w:val="en-DE"/>
+        </w:rPr>
+        <w:t>24.</w:t>
+      </w:r>
+    </w:p>
+    <w:p>
+      <w:pPr>
+        <w:rPr>
+          <w:rFonts w:ascii="Arial" w:hAnsi="Arial"/>
+          <w:sz w:val="22"/>
+          <w:lang w:val="en-DE"/>
+        </w:rPr>
+      </w:pPr>
+    </w:p>
+    <w:p>
+      <w:pPr>
+        <w:rPr>
+          <w:rFonts w:ascii="Arial" w:hAnsi="Arial"/>
+          <w:b/>
+          <w:sz w:val="22"/>
+          <w:lang w:val="en-DE"/>
+        </w:rPr>
+      </w:pPr>
+    </w:p>
+    <w:p>
+      <w:pPr>
+        <w:rPr>
+          <w:rFonts w:ascii="Arial" w:hAnsi="Arial"/>
+          <w:sz w:val="22"/>
+          <w:lang w:val="en-DE"/>
+        </w:rPr>
+      </w:pPr>
+      <w:proofErr w:type="spellStart"/>
+      <w:r>
+        <w:rPr>
+          <w:rFonts w:ascii="Arial" w:hAnsi="Arial"/>
+          <w:b/>
+          <w:sz w:val="22"/>
+          <w:lang w:val="en-DE"/>
+        </w:rPr>
+        <w:t>Haidi</w:t>
+      </w:r>
+      <w:proofErr w:type="spellEnd"/>
+      <w:r>
+        <w:rPr>
+          <w:rFonts w:ascii="Arial" w:hAnsi="Arial"/>
+          <w:b/>
+          <w:sz w:val="22"/>
+          <w:lang w:val="en-DE"/>
+        </w:rPr>
+        <w:t xml:space="preserve"> Toto- </w:t>
+      </w:r>
+      <w:r>
+        <w:rPr>
+          <w:rFonts w:ascii="Arial" w:hAnsi="Arial"/>
+          <w:sz w:val="22"/>
+          <w:lang w:val="en-DE"/>
+        </w:rPr>
+        <w:t xml:space="preserve">Creating the tables for </w:t>
+      </w:r>
+      <w:proofErr w:type="spellStart"/>
+      <w:r>
+        <w:rPr>
+          <w:rFonts w:ascii="Arial" w:hAnsi="Arial"/>
+          <w:sz w:val="22"/>
+          <w:lang w:val="en-DE"/>
+        </w:rPr>
+        <w:t>RentalRequest</w:t>
+      </w:r>
+      <w:proofErr w:type="spellEnd"/>
+      <w:r>
+        <w:rPr>
+          <w:rFonts w:ascii="Arial" w:hAnsi="Arial"/>
+          <w:sz w:val="22"/>
+          <w:lang w:val="en-DE"/>
+        </w:rPr>
+        <w:t>, Booking, Payment</w:t>
+      </w:r>
+      <w:r>
+        <w:rPr>
+          <w:rFonts w:ascii="Arial" w:hAnsi="Arial"/>
+          <w:sz w:val="22"/>
+          <w:lang w:val="en-DE"/>
+        </w:rPr>
+        <w:t xml:space="preserve"> for class diagram.</w:t>
+      </w:r>
+    </w:p>
+    <w:p>
+      <w:pPr>
+        <w:rPr>
+          <w:rFonts w:ascii="Arial" w:hAnsi="Arial"/>
+          <w:sz w:val="22"/>
+          <w:lang w:val="en-DE"/>
+        </w:rPr>
+      </w:pPr>
+      <w:r>
+        <w:rPr>
+          <w:rFonts w:ascii="Arial" w:hAnsi="Arial"/>
+          <w:sz w:val="22"/>
+          <w:lang w:val="en-DE"/>
+        </w:rPr>
+        <w:t xml:space="preserve">                      Creating the sequence diagrams for FR7-FR</w:t>
+      </w:r>
+      <w:r>
+        <w:rPr>
+          <w:rFonts w:ascii="Arial" w:hAnsi="Arial"/>
+          <w:sz w:val="22"/>
+          <w:lang w:val="en-DE"/>
+        </w:rPr>
+        <w:t>12.</w:t>
+      </w:r>
+    </w:p>
+    <w:p>
+      <w:pPr>
+        <w:rPr>
+          <w:rFonts w:ascii="Arial" w:hAnsi="Arial"/>
+          <w:sz w:val="22"/>
+          <w:lang w:val="en-DE"/>
+        </w:rPr>
+      </w:pPr>
+    </w:p>
+    <w:p>
+      <w:pPr>
+        <w:rPr>
+          <w:rFonts w:ascii="Arial" w:hAnsi="Arial"/>
+          <w:sz w:val="22"/>
+          <w:lang w:val="en-DE"/>
+        </w:rPr>
+      </w:pPr>
+      <w:proofErr w:type="spellStart"/>
+      <w:r>
+        <w:rPr>
+          <w:rFonts w:ascii="Arial" w:hAnsi="Arial"/>
+          <w:b/>
+          <w:sz w:val="22"/>
+          <w:lang w:val="en-DE"/>
+        </w:rPr>
+        <w:t>Ledio</w:t>
+      </w:r>
+      <w:proofErr w:type="spellEnd"/>
+      <w:r>
+        <w:rPr>
+          <w:rFonts w:ascii="Arial" w:hAnsi="Arial"/>
+          <w:b/>
+          <w:sz w:val="22"/>
+          <w:lang w:val="en-DE"/>
+        </w:rPr>
+        <w:t xml:space="preserve"> </w:t>
+      </w:r>
+      <w:proofErr w:type="spellStart"/>
+      <w:r>
+        <w:rPr>
+          <w:rFonts w:ascii="Arial" w:hAnsi="Arial"/>
+          <w:b/>
+          <w:sz w:val="22"/>
+          <w:lang w:val="en-DE"/>
+        </w:rPr>
+        <w:t>Tafciu</w:t>
+      </w:r>
+      <w:proofErr w:type="spellEnd"/>
+      <w:r>
+        <w:rPr>
+          <w:rFonts w:ascii="Arial" w:hAnsi="Arial"/>
+          <w:b/>
+          <w:sz w:val="22"/>
+          <w:lang w:val="en-DE"/>
+        </w:rPr>
+        <w:t xml:space="preserve">- </w:t>
+      </w:r>
+      <w:r>
+        <w:rPr>
+          <w:rFonts w:ascii="Arial" w:hAnsi="Arial"/>
+          <w:sz w:val="22"/>
+          <w:lang w:val="en-DE"/>
+        </w:rPr>
+        <w:t xml:space="preserve">Creating the tables for </w:t>
+      </w:r>
+      <w:r>
+        <w:rPr>
+          <w:rFonts w:ascii="Arial" w:hAnsi="Arial"/>
+          <w:sz w:val="22"/>
+          <w:lang w:val="en-DE"/>
+        </w:rPr>
+        <w:t xml:space="preserve">Property, </w:t>
+      </w:r>
+      <w:proofErr w:type="spellStart"/>
+      <w:r>
+        <w:rPr>
+          <w:rFonts w:ascii="Arial" w:hAnsi="Arial"/>
+          <w:sz w:val="22"/>
+          <w:lang w:val="en-DE"/>
+        </w:rPr>
+        <w:t>PropertyImage</w:t>
+      </w:r>
+      <w:proofErr w:type="spellEnd"/>
+      <w:r>
+        <w:rPr>
+          <w:rFonts w:ascii="Arial" w:hAnsi="Arial"/>
+          <w:sz w:val="22"/>
+          <w:lang w:val="en-DE"/>
+        </w:rPr>
+        <w:t>, Promotion</w:t>
+      </w:r>
+      <w:r>
+        <w:rPr>
+          <w:rFonts w:ascii="Arial" w:hAnsi="Arial"/>
+          <w:sz w:val="22"/>
+          <w:lang w:val="en-DE"/>
+        </w:rPr>
+        <w:t xml:space="preserve"> for class diagram.</w:t>
+      </w:r>
+    </w:p>
+    <w:p>
+      <w:pPr>
+        <w:rPr>
+          <w:rFonts w:ascii="Arial" w:hAnsi="Arial"/>
+          <w:sz w:val="22"/>
+          <w:lang w:val="en-DE"/>
+        </w:rPr>
+      </w:pPr>
+      <w:r>
+        <w:rPr>
+          <w:rFonts w:ascii="Arial" w:hAnsi="Arial"/>
+          <w:sz w:val="22"/>
+          <w:lang w:val="en-DE"/>
+        </w:rPr>
+        <w:t xml:space="preserve">                      Creating the sequence diagrams for FR</w:t>
+      </w:r>
+      <w:r>
+        <w:rPr>
+          <w:rFonts w:ascii="Arial" w:hAnsi="Arial"/>
+          <w:sz w:val="22"/>
+          <w:lang w:val="en-DE"/>
+        </w:rPr>
+        <w:t>1</w:t>
+      </w:r>
+      <w:r>
+        <w:rPr>
+          <w:rFonts w:ascii="Arial" w:hAnsi="Arial"/>
+          <w:sz w:val="22"/>
+          <w:lang w:val="en-DE"/>
+        </w:rPr>
+        <w:t>3-FR</w:t>
+      </w:r>
+      <w:r>
+        <w:rPr>
+          <w:rFonts w:ascii="Arial" w:hAnsi="Arial"/>
+          <w:sz w:val="22"/>
+          <w:lang w:val="en-DE"/>
+        </w:rPr>
+        <w:t>18.</w:t>
+      </w:r>
+    </w:p>
+    <w:p>
+      <w:pPr>
+        <w:rPr>
+          <w:rFonts w:ascii="Arial" w:hAnsi="Arial"/>
+          <w:sz w:val="22"/>
+          <w:lang w:val="en-DE"/>
+        </w:rPr>
+      </w:pPr>
+    </w:p>
+    <w:p>
+      <w:pPr>
+        <w:rPr>
+          <w:rFonts w:ascii="Arial" w:hAnsi="Arial"/>
+          <w:sz w:val="22"/>
+          <w:lang w:val="en-DE"/>
+        </w:rPr>
+      </w:pPr>
+      <w:r>
+        <w:rPr>
+          <w:rFonts w:ascii="Arial" w:hAnsi="Arial"/>
+          <w:b/>
+          <w:sz w:val="22"/>
+          <w:lang w:val="en-DE"/>
+        </w:rPr>
+        <w:t xml:space="preserve">Matias Bali- </w:t>
+      </w:r>
+      <w:r>
+        <w:rPr>
+          <w:rFonts w:ascii="Arial" w:hAnsi="Arial"/>
+          <w:sz w:val="22"/>
+          <w:lang w:val="en-DE"/>
+        </w:rPr>
+        <w:t xml:space="preserve">Creating the tables for </w:t>
+      </w:r>
+      <w:r>
+        <w:rPr>
+          <w:rFonts w:ascii="Arial" w:hAnsi="Arial"/>
+          <w:sz w:val="22"/>
+          <w:lang w:val="en-DE"/>
+        </w:rPr>
+        <w:t xml:space="preserve">Message, Notification, Review </w:t>
+      </w:r>
+      <w:r>
+        <w:rPr>
+          <w:rFonts w:ascii="Arial" w:hAnsi="Arial"/>
+          <w:sz w:val="22"/>
+          <w:lang w:val="en-DE"/>
+        </w:rPr>
+        <w:t>for class diagram.</w:t>
+      </w:r>
+    </w:p>
+    <w:p>
+      <w:pPr>
+        <w:rPr>
+          <w:rFonts w:ascii="Arial" w:hAnsi="Arial"/>
+          <w:sz w:val="22"/>
+          <w:lang w:val="en-DE"/>
+        </w:rPr>
+      </w:pPr>
+      <w:r>
+        <w:rPr>
+          <w:rFonts w:ascii="Arial" w:hAnsi="Arial"/>
+          <w:sz w:val="22"/>
+          <w:lang w:val="en-DE"/>
+        </w:rPr>
+        <w:t xml:space="preserve">                      Creating the sequence diagrams for FR</w:t>
+      </w:r>
+      <w:r>
+        <w:rPr>
+          <w:rFonts w:ascii="Arial" w:hAnsi="Arial"/>
+          <w:sz w:val="22"/>
+          <w:lang w:val="en-DE"/>
+        </w:rPr>
+        <w:t>25</w:t>
+      </w:r>
+      <w:r>
+        <w:rPr>
+          <w:rFonts w:ascii="Arial" w:hAnsi="Arial"/>
+          <w:sz w:val="22"/>
+          <w:lang w:val="en-DE"/>
+        </w:rPr>
+        <w:t>-FR</w:t>
+      </w:r>
+      <w:r>
+        <w:rPr>
+          <w:rFonts w:ascii="Arial" w:hAnsi="Arial"/>
+          <w:sz w:val="22"/>
+          <w:lang w:val="en-DE"/>
+        </w:rPr>
+        <w:t>30.</w:t>
+      </w:r>
+    </w:p>
+    <w:p>
+      <w:pPr>
+        <w:rPr>
+          <w:rFonts w:ascii="Arial" w:hAnsi="Arial"/>
+          <w:sz w:val="22"/>
+          <w:lang w:val="en-DE"/>
+        </w:rPr>
+      </w:pPr>
+    </w:p>
+    <w:p>
+      <w:pPr>
+        <w:rPr>
+          <w:rFonts w:ascii="Arial" w:hAnsi="Arial"/>
+          <w:sz w:val="22"/>
+          <w:lang w:val="en-DE"/>
+        </w:rPr>
+      </w:pPr>
+      <w:proofErr w:type="spellStart"/>
+      <w:r>
+        <w:rPr>
+          <w:rFonts w:ascii="Arial" w:hAnsi="Arial"/>
+          <w:b/>
+          <w:sz w:val="22"/>
+          <w:lang w:val="en-DE"/>
+        </w:rPr>
+        <w:t>Ornelt</w:t>
+      </w:r>
+      <w:proofErr w:type="spellEnd"/>
+      <w:r>
+        <w:rPr>
+          <w:rFonts w:ascii="Arial" w:hAnsi="Arial"/>
+          <w:b/>
+          <w:sz w:val="22"/>
+          <w:lang w:val="en-DE"/>
+        </w:rPr>
+        <w:t xml:space="preserve"> </w:t>
+      </w:r>
+      <w:proofErr w:type="spellStart"/>
+      <w:r>
+        <w:rPr>
+          <w:rFonts w:ascii="Arial" w:hAnsi="Arial"/>
+          <w:b/>
+          <w:sz w:val="22"/>
+          <w:lang w:val="en-DE"/>
+        </w:rPr>
+        <w:t>Lemellari</w:t>
+      </w:r>
+      <w:proofErr w:type="spellEnd"/>
+      <w:r>
+        <w:rPr>
+          <w:rFonts w:ascii="Arial" w:hAnsi="Arial"/>
+          <w:b/>
+          <w:sz w:val="22"/>
+          <w:lang w:val="en-DE"/>
+        </w:rPr>
+        <w:t xml:space="preserve">- </w:t>
+      </w:r>
+      <w:r>
+        <w:rPr>
+          <w:rFonts w:ascii="Arial" w:hAnsi="Arial"/>
+          <w:sz w:val="22"/>
+          <w:lang w:val="en-DE"/>
+        </w:rPr>
+        <w:t xml:space="preserve">Creating the tables for </w:t>
+      </w:r>
+      <w:r>
+        <w:rPr>
+          <w:rFonts w:ascii="Arial" w:hAnsi="Arial"/>
+          <w:sz w:val="22"/>
+          <w:lang w:val="en-DE"/>
+        </w:rPr>
+        <w:t xml:space="preserve">Complaint, </w:t>
+      </w:r>
+      <w:proofErr w:type="spellStart"/>
+      <w:r>
+        <w:rPr>
+          <w:rFonts w:ascii="Arial" w:hAnsi="Arial"/>
+          <w:sz w:val="22"/>
+          <w:lang w:val="en-DE"/>
+        </w:rPr>
+        <w:t>IssueResolution</w:t>
+      </w:r>
+      <w:proofErr w:type="spellEnd"/>
+      <w:r>
+        <w:rPr>
+          <w:rFonts w:ascii="Arial" w:hAnsi="Arial"/>
+          <w:sz w:val="22"/>
+          <w:lang w:val="en-DE"/>
+        </w:rPr>
+        <w:t>, Report</w:t>
+      </w:r>
+      <w:r>
+        <w:rPr>
+          <w:rFonts w:ascii="Arial" w:hAnsi="Arial"/>
+          <w:sz w:val="22"/>
+          <w:lang w:val="en-DE"/>
+        </w:rPr>
+        <w:t xml:space="preserve"> for class diagram.</w:t>
+      </w:r>
+    </w:p>
+    <w:p>
+      <w:pPr>
+        <w:rPr>
+          <w:rFonts w:ascii="Arial" w:hAnsi="Arial"/>
+          <w:sz w:val="22"/>
+          <w:lang w:val="en-DE"/>
+        </w:rPr>
+      </w:pPr>
+      <w:r>
+        <w:rPr>
+          <w:rFonts w:ascii="Arial" w:hAnsi="Arial"/>
+          <w:sz w:val="22"/>
+          <w:lang w:val="en-DE"/>
+        </w:rPr>
+        <w:t xml:space="preserve">                      Creating the sequence diagrams for FR3</w:t>
+      </w:r>
+      <w:r>
+        <w:rPr>
+          <w:rFonts w:ascii="Arial" w:hAnsi="Arial"/>
+          <w:sz w:val="22"/>
+          <w:lang w:val="en-DE"/>
+        </w:rPr>
+        <w:t>1</w:t>
+      </w:r>
+      <w:r>
+        <w:rPr>
+          <w:rFonts w:ascii="Arial" w:hAnsi="Arial"/>
+          <w:sz w:val="22"/>
+          <w:lang w:val="en-DE"/>
+        </w:rPr>
+        <w:t>-FR</w:t>
+      </w:r>
+      <w:r>
+        <w:rPr>
+          <w:rFonts w:ascii="Arial" w:hAnsi="Arial"/>
+          <w:sz w:val="22"/>
+          <w:lang w:val="en-DE"/>
+        </w:rPr>
+        <w:t>36.</w:t>
+      </w:r>
+    </w:p>
+    <w:p>
+      <w:pPr>
+        <w:rPr>
+          <w:rFonts w:ascii="Arial" w:hAnsi="Arial"/>
+          <w:sz w:val="22"/>
+          <w:lang w:val="en-DE"/>
+        </w:rPr>
+      </w:pPr>
     </w:p>
     <w:p>
       <w:pPr>
@@ -1264,8 +1986,6 @@
         </w:rPr>
         <w:t xml:space="preserve"> Tasks for next weeks project requirements.</w:t>
       </w:r>
-      <w:bookmarkStart w:id="0" w:name="_GoBack"/>
-      <w:bookmarkEnd w:id="0"/>
     </w:p>
     <w:sectPr>
       <w:pgSz w:w="11906" w:h="16838"/>

</xml_diff>